<commit_message>
ahgIntegrityPlugin v1.1.0: Issues #188, #189, #190 — ledger actor/hostname tracking, CSV export, auditor pack, retention policies, legal   holds, disposition queue, enhanced dashboard, threshold alerting
</commit_message>
<xml_diff>
--- a/ahgIntegrityPlugin/docs/AtoM_Heratio_IntegrityAssurance_Feature_Overview.docx
+++ b/ahgIntegrityPlugin/docs/AtoM_Heratio_IntegrityAssurance_Feature_Overview.docx
@@ -18,7 +18,7 @@
         <w:t xml:space="preserve">The Archive and Heritage Group (Pty) Ltd</w:t>
       </w:r>
     </w:p>
-    <w:bookmarkStart w:id="36" w:name="atom-heratio-integrity-assurance-plugin"/>
+    <w:bookmarkStart w:id="41" w:name="atom-heratio-integrity-assurance-plugin"/>
     <w:p>
       <w:pPr>
         <w:pStyle w:val="Heading1"/>
@@ -51,7 +51,7 @@
         <w:t xml:space="preserve"> </w:t>
       </w:r>
       <w:r>
-        <w:t xml:space="preserve">ahgIntegrityPlugin v1.0.0</w:t>
+        <w:t xml:space="preserve">ahgIntegrityPlugin v1.1.0</w:t>
       </w:r>
       <w:r>
         <w:t xml:space="preserve"> </w:t>
@@ -132,11 +132,11 @@
         <w:pStyle w:val="BodyText"/>
       </w:pPr>
       <w:r>
-        <w:t xml:space="preserve">The plugin builds on the existing Digital Preservation plugin’s checksum infrastructure, adding sophisticated scheduling, concurrency controls, and failure management capabilities required by large-scale GLAM and DAM institutions.</w:t>
+        <w:t xml:space="preserve">The plugin builds on the existing Digital Preservation plugin’s checksum infrastructure, adding sophisticated scheduling, concurrency controls, failure management, retention policies, legal holds, and threshold-based alerting required by large-scale GLAM and DAM institutions.</w:t>
       </w:r>
     </w:p>
     <w:bookmarkEnd w:id="21"/>
-    <w:bookmarkStart w:id="29" w:name="key-features"/>
+    <w:bookmarkStart w:id="34" w:name="key-features"/>
     <w:p>
       <w:pPr>
         <w:pStyle w:val="Heading2"/>
@@ -417,6 +417,28 @@
         <w:pStyle w:val="Compact"/>
       </w:pPr>
       <w:r>
+        <w:rPr>
+          <w:bCs/>
+          <w:b/>
+        </w:rPr>
+        <w:t xml:space="preserve">Actor and hostname tracking</w:t>
+      </w:r>
+      <w:r>
+        <w:t xml:space="preserve"> </w:t>
+      </w:r>
+      <w:r>
+        <w:t xml:space="preserve">for multi-server environments</w:t>
+      </w:r>
+    </w:p>
+    <w:p>
+      <w:pPr>
+        <w:numPr>
+          <w:ilvl w:val="0"/>
+          <w:numId w:val="1003"/>
+        </w:numPr>
+        <w:pStyle w:val="Compact"/>
+      </w:pPr>
+      <w:r>
         <w:t xml:space="preserve">Denormalized repository and information object IDs for efficient scoped queries</w:t>
       </w:r>
     </w:p>
@@ -491,12 +513,500 @@
       </w:r>
     </w:p>
     <w:bookmarkEnd w:id="25"/>
-    <w:bookmarkStart w:id="26" w:name="admin-dashboard"/>
+    <w:bookmarkStart w:id="26" w:name="csv-export-auditor-pack-v1.1.0"/>
     <w:p>
       <w:pPr>
         <w:pStyle w:val="Heading3"/>
       </w:pPr>
       <w:r>
+        <w:t xml:space="preserve">CSV Export &amp; Auditor Pack (v1.1.0)</w:t>
+      </w:r>
+    </w:p>
+    <w:p>
+      <w:pPr>
+        <w:numPr>
+          <w:ilvl w:val="0"/>
+          <w:numId w:val="1005"/>
+        </w:numPr>
+        <w:pStyle w:val="Compact"/>
+      </w:pPr>
+      <w:r>
+        <w:rPr>
+          <w:bCs/>
+          <w:b/>
+        </w:rPr>
+        <w:t xml:space="preserve">CSV export</w:t>
+      </w:r>
+      <w:r>
+        <w:t xml:space="preserve">: Download the complete verification ledger with date, repository, and outcome filters</w:t>
+      </w:r>
+    </w:p>
+    <w:p>
+      <w:pPr>
+        <w:numPr>
+          <w:ilvl w:val="0"/>
+          <w:numId w:val="1005"/>
+        </w:numPr>
+        <w:pStyle w:val="Compact"/>
+      </w:pPr>
+      <w:r>
+        <w:rPr>
+          <w:bCs/>
+          <w:b/>
+        </w:rPr>
+        <w:t xml:space="preserve">Auditor Pack</w:t>
+      </w:r>
+      <w:r>
+        <w:t xml:space="preserve">: ZIP archive containing standalone summary.html (no external dependencies), exceptions.csv, and config-snapshot.json</w:t>
+      </w:r>
+    </w:p>
+    <w:p>
+      <w:pPr>
+        <w:numPr>
+          <w:ilvl w:val="0"/>
+          <w:numId w:val="1005"/>
+        </w:numPr>
+        <w:pStyle w:val="Compact"/>
+      </w:pPr>
+      <w:r>
+        <w:rPr>
+          <w:bCs/>
+          <w:b/>
+        </w:rPr>
+        <w:t xml:space="preserve">CLI export</w:t>
+      </w:r>
+      <w:r>
+        <w:t xml:space="preserve">:</w:t>
+      </w:r>
+      <w:r>
+        <w:t xml:space="preserve"> </w:t>
+      </w:r>
+      <w:r>
+        <w:rPr>
+          <w:rStyle w:val="VerbatimChar"/>
+        </w:rPr>
+        <w:t xml:space="preserve">--export-csv</w:t>
+      </w:r>
+      <w:r>
+        <w:t xml:space="preserve"> </w:t>
+      </w:r>
+      <w:r>
+        <w:t xml:space="preserve">and</w:t>
+      </w:r>
+      <w:r>
+        <w:t xml:space="preserve"> </w:t>
+      </w:r>
+      <w:r>
+        <w:rPr>
+          <w:rStyle w:val="VerbatimChar"/>
+        </w:rPr>
+        <w:t xml:space="preserve">--auditor-pack</w:t>
+      </w:r>
+      <w:r>
+        <w:t xml:space="preserve"> </w:t>
+      </w:r>
+      <w:r>
+        <w:t xml:space="preserve">flags for automated reporting pipelines</w:t>
+      </w:r>
+    </w:p>
+    <w:bookmarkEnd w:id="26"/>
+    <w:bookmarkStart w:id="27" w:name="retention-policy-engine-v1.1.0"/>
+    <w:p>
+      <w:pPr>
+        <w:pStyle w:val="Heading3"/>
+      </w:pPr>
+      <w:r>
+        <w:t xml:space="preserve">Retention Policy Engine (v1.1.0)</w:t>
+      </w:r>
+    </w:p>
+    <w:p>
+      <w:pPr>
+        <w:numPr>
+          <w:ilvl w:val="0"/>
+          <w:numId w:val="1006"/>
+        </w:numPr>
+        <w:pStyle w:val="Compact"/>
+      </w:pPr>
+      <w:r>
+        <w:rPr>
+          <w:bCs/>
+          <w:b/>
+        </w:rPr>
+        <w:t xml:space="preserve">Policy definitions</w:t>
+      </w:r>
+      <w:r>
+        <w:t xml:space="preserve">: Name, description, retention period (days), trigger type, scope</w:t>
+      </w:r>
+    </w:p>
+    <w:p>
+      <w:pPr>
+        <w:numPr>
+          <w:ilvl w:val="0"/>
+          <w:numId w:val="1006"/>
+        </w:numPr>
+        <w:pStyle w:val="Compact"/>
+      </w:pPr>
+      <w:r>
+        <w:rPr>
+          <w:bCs/>
+          <w:b/>
+        </w:rPr>
+        <w:t xml:space="preserve">Trigger types</w:t>
+      </w:r>
+      <w:r>
+        <w:t xml:space="preserve">: Ingest date, last modified, closure date, last access</w:t>
+      </w:r>
+    </w:p>
+    <w:p>
+      <w:pPr>
+        <w:numPr>
+          <w:ilvl w:val="0"/>
+          <w:numId w:val="1006"/>
+        </w:numPr>
+        <w:pStyle w:val="Compact"/>
+      </w:pPr>
+      <w:r>
+        <w:rPr>
+          <w:bCs/>
+          <w:b/>
+        </w:rPr>
+        <w:t xml:space="preserve">Scope types</w:t>
+      </w:r>
+      <w:r>
+        <w:t xml:space="preserve">: Global, per-repository, or per-hierarchy node</w:t>
+      </w:r>
+    </w:p>
+    <w:p>
+      <w:pPr>
+        <w:numPr>
+          <w:ilvl w:val="0"/>
+          <w:numId w:val="1006"/>
+        </w:numPr>
+        <w:pStyle w:val="Compact"/>
+      </w:pPr>
+      <w:r>
+        <w:rPr>
+          <w:bCs/>
+          <w:b/>
+        </w:rPr>
+        <w:t xml:space="preserve">Disposition review queue</w:t>
+      </w:r>
+      <w:r>
+        <w:t xml:space="preserve">: Eligible, Pending Review, Approved, Rejected, Held, Disposed</w:t>
+      </w:r>
+    </w:p>
+    <w:p>
+      <w:pPr>
+        <w:numPr>
+          <w:ilvl w:val="0"/>
+          <w:numId w:val="1006"/>
+        </w:numPr>
+        <w:pStyle w:val="Compact"/>
+      </w:pPr>
+      <w:r>
+        <w:rPr>
+          <w:bCs/>
+          <w:b/>
+        </w:rPr>
+        <w:t xml:space="preserve">Safe disposition</w:t>
+      </w:r>
+      <w:r>
+        <w:t xml:space="preserve">: Marks as</w:t>
+      </w:r>
+      <w:r>
+        <w:t xml:space="preserve"> </w:t>
+      </w:r>
+      <w:r>
+        <w:t xml:space="preserve">“</w:t>
+      </w:r>
+      <w:r>
+        <w:t xml:space="preserve">disposed</w:t>
+      </w:r>
+      <w:r>
+        <w:t xml:space="preserve">”</w:t>
+      </w:r>
+      <w:r>
+        <w:t xml:space="preserve"> </w:t>
+      </w:r>
+      <w:r>
+        <w:t xml:space="preserve">only — no actual deletion (preserving archival integrity)</w:t>
+      </w:r>
+    </w:p>
+    <w:bookmarkEnd w:id="27"/>
+    <w:bookmarkStart w:id="28" w:name="legal-holds-v1.1.0"/>
+    <w:p>
+      <w:pPr>
+        <w:pStyle w:val="Heading3"/>
+      </w:pPr>
+      <w:r>
+        <w:t xml:space="preserve">Legal Holds (v1.1.0)</w:t>
+      </w:r>
+    </w:p>
+    <w:p>
+      <w:pPr>
+        <w:numPr>
+          <w:ilvl w:val="0"/>
+          <w:numId w:val="1007"/>
+        </w:numPr>
+        <w:pStyle w:val="Compact"/>
+      </w:pPr>
+      <w:r>
+        <w:t xml:space="preserve">Place legal holds on information objects to block disposition</w:t>
+      </w:r>
+    </w:p>
+    <w:p>
+      <w:pPr>
+        <w:numPr>
+          <w:ilvl w:val="0"/>
+          <w:numId w:val="1007"/>
+        </w:numPr>
+        <w:pStyle w:val="Compact"/>
+      </w:pPr>
+      <w:r>
+        <w:t xml:space="preserve">Automatic blocking of disposition queue entries when hold is placed</w:t>
+      </w:r>
+    </w:p>
+    <w:p>
+      <w:pPr>
+        <w:numPr>
+          <w:ilvl w:val="0"/>
+          <w:numId w:val="1007"/>
+        </w:numPr>
+        <w:pStyle w:val="Compact"/>
+      </w:pPr>
+      <w:r>
+        <w:t xml:space="preserve">Release workflow with re-evaluation of queue entries</w:t>
+      </w:r>
+    </w:p>
+    <w:p>
+      <w:pPr>
+        <w:numPr>
+          <w:ilvl w:val="0"/>
+          <w:numId w:val="1007"/>
+        </w:numPr>
+        <w:pStyle w:val="Compact"/>
+      </w:pPr>
+      <w:r>
+        <w:t xml:space="preserve">Full audit trail in the verification ledger</w:t>
+      </w:r>
+    </w:p>
+    <w:bookmarkEnd w:id="28"/>
+    <w:bookmarkStart w:id="29" w:name="threshold-based-alerting-v1.1.0"/>
+    <w:p>
+      <w:pPr>
+        <w:pStyle w:val="Heading3"/>
+      </w:pPr>
+      <w:r>
+        <w:t xml:space="preserve">Threshold-Based Alerting (v1.1.0)</w:t>
+      </w:r>
+    </w:p>
+    <w:p>
+      <w:pPr>
+        <w:numPr>
+          <w:ilvl w:val="0"/>
+          <w:numId w:val="1008"/>
+        </w:numPr>
+        <w:pStyle w:val="Compact"/>
+      </w:pPr>
+      <w:r>
+        <w:rPr>
+          <w:bCs/>
+          <w:b/>
+        </w:rPr>
+        <w:t xml:space="preserve">Alert types</w:t>
+      </w:r>
+      <w:r>
+        <w:t xml:space="preserve">: Pass rate below threshold, failure count above, dead letter count above, backlog above, run failure</w:t>
+      </w:r>
+    </w:p>
+    <w:p>
+      <w:pPr>
+        <w:numPr>
+          <w:ilvl w:val="0"/>
+          <w:numId w:val="1008"/>
+        </w:numPr>
+        <w:pStyle w:val="Compact"/>
+      </w:pPr>
+      <w:r>
+        <w:rPr>
+          <w:bCs/>
+          <w:b/>
+        </w:rPr>
+        <w:t xml:space="preserve">Email notifications</w:t>
+      </w:r>
+      <w:r>
+        <w:t xml:space="preserve">: Via SwiftMailer (matches existing AtoM pattern)</w:t>
+      </w:r>
+    </w:p>
+    <w:p>
+      <w:pPr>
+        <w:numPr>
+          <w:ilvl w:val="0"/>
+          <w:numId w:val="1008"/>
+        </w:numPr>
+        <w:pStyle w:val="Compact"/>
+      </w:pPr>
+      <w:r>
+        <w:rPr>
+          <w:bCs/>
+          <w:b/>
+        </w:rPr>
+        <w:t xml:space="preserve">Webhook notifications</w:t>
+      </w:r>
+      <w:r>
+        <w:t xml:space="preserve">: HTTP POST with HMAC-SHA256 signature verification</w:t>
+      </w:r>
+    </w:p>
+    <w:p>
+      <w:pPr>
+        <w:numPr>
+          <w:ilvl w:val="0"/>
+          <w:numId w:val="1008"/>
+        </w:numPr>
+        <w:pStyle w:val="Compact"/>
+      </w:pPr>
+      <w:r>
+        <w:rPr>
+          <w:bCs/>
+          <w:b/>
+        </w:rPr>
+        <w:t xml:space="preserve">Schedule notifications</w:t>
+      </w:r>
+      <w:r>
+        <w:t xml:space="preserve">: Existing notify_email, notify_on_failure, notify_on_mismatch wired to alert system</w:t>
+      </w:r>
+    </w:p>
+    <w:p>
+      <w:pPr>
+        <w:numPr>
+          <w:ilvl w:val="0"/>
+          <w:numId w:val="1008"/>
+        </w:numPr>
+        <w:pStyle w:val="Compact"/>
+      </w:pPr>
+      <w:r>
+        <w:rPr>
+          <w:bCs/>
+          <w:b/>
+        </w:rPr>
+        <w:t xml:space="preserve">Non-fatal</w:t>
+      </w:r>
+      <w:r>
+        <w:t xml:space="preserve">: Alert failures never break verification runs</w:t>
+      </w:r>
+    </w:p>
+    <w:bookmarkEnd w:id="29"/>
+    <w:bookmarkStart w:id="30" w:name="enhanced-dashboard-v1.1.0"/>
+    <w:p>
+      <w:pPr>
+        <w:pStyle w:val="Heading3"/>
+      </w:pPr>
+      <w:r>
+        <w:t xml:space="preserve">Enhanced Dashboard (v1.1.0)</w:t>
+      </w:r>
+    </w:p>
+    <w:p>
+      <w:pPr>
+        <w:numPr>
+          <w:ilvl w:val="0"/>
+          <w:numId w:val="1009"/>
+        </w:numPr>
+        <w:pStyle w:val="Compact"/>
+      </w:pPr>
+      <w:r>
+        <w:rPr>
+          <w:bCs/>
+          <w:b/>
+        </w:rPr>
+        <w:t xml:space="preserve">Backlog card</w:t>
+      </w:r>
+      <w:r>
+        <w:t xml:space="preserve">: Count of master digital objects never verified</w:t>
+      </w:r>
+    </w:p>
+    <w:p>
+      <w:pPr>
+        <w:numPr>
+          <w:ilvl w:val="0"/>
+          <w:numId w:val="1009"/>
+        </w:numPr>
+        <w:pStyle w:val="Compact"/>
+      </w:pPr>
+      <w:r>
+        <w:rPr>
+          <w:bCs/>
+          <w:b/>
+        </w:rPr>
+        <w:t xml:space="preserve">Throughput card</w:t>
+      </w:r>
+      <w:r>
+        <w:t xml:space="preserve">: Objects/hour and GB/hour over the last 7 days</w:t>
+      </w:r>
+    </w:p>
+    <w:p>
+      <w:pPr>
+        <w:numPr>
+          <w:ilvl w:val="0"/>
+          <w:numId w:val="1009"/>
+        </w:numPr>
+        <w:pStyle w:val="Compact"/>
+      </w:pPr>
+      <w:r>
+        <w:rPr>
+          <w:bCs/>
+          <w:b/>
+        </w:rPr>
+        <w:t xml:space="preserve">Daily Trend chart</w:t>
+      </w:r>
+      <w:r>
+        <w:t xml:space="preserve">: CSS-only horizontal bar chart (30 days), green=pass, red=fail</w:t>
+      </w:r>
+    </w:p>
+    <w:p>
+      <w:pPr>
+        <w:numPr>
+          <w:ilvl w:val="0"/>
+          <w:numId w:val="1009"/>
+        </w:numPr>
+        <w:pStyle w:val="Compact"/>
+      </w:pPr>
+      <w:r>
+        <w:rPr>
+          <w:bCs/>
+          <w:b/>
+        </w:rPr>
+        <w:t xml:space="preserve">Repository Breakdown table</w:t>
+      </w:r>
+      <w:r>
+        <w:t xml:space="preserve">: Per-repository totals, pass/fail counts, pass rate</w:t>
+      </w:r>
+    </w:p>
+    <w:p>
+      <w:pPr>
+        <w:numPr>
+          <w:ilvl w:val="0"/>
+          <w:numId w:val="1009"/>
+        </w:numPr>
+        <w:pStyle w:val="Compact"/>
+      </w:pPr>
+      <w:r>
+        <w:rPr>
+          <w:bCs/>
+          <w:b/>
+        </w:rPr>
+        <w:t xml:space="preserve">Failure Type Breakdown table</w:t>
+      </w:r>
+      <w:r>
+        <w:t xml:space="preserve">: Outcome distribution with percentages</w:t>
+      </w:r>
+    </w:p>
+    <w:bookmarkEnd w:id="30"/>
+    <w:bookmarkStart w:id="31" w:name="admin-dashboard"/>
+    <w:p>
+      <w:pPr>
+        <w:pStyle w:val="Heading3"/>
+      </w:pPr>
+      <w:r>
         <w:t xml:space="preserve">Admin Dashboard</w:t>
       </w:r>
     </w:p>
@@ -504,7 +1014,7 @@
       <w:pPr>
         <w:numPr>
           <w:ilvl w:val="0"/>
-          <w:numId w:val="1005"/>
+          <w:numId w:val="1010"/>
         </w:numPr>
         <w:pStyle w:val="Compact"/>
       </w:pPr>
@@ -516,7 +1026,7 @@
       <w:pPr>
         <w:numPr>
           <w:ilvl w:val="0"/>
-          <w:numId w:val="1005"/>
+          <w:numId w:val="1010"/>
         </w:numPr>
         <w:pStyle w:val="Compact"/>
       </w:pPr>
@@ -528,7 +1038,7 @@
       <w:pPr>
         <w:numPr>
           <w:ilvl w:val="0"/>
-          <w:numId w:val="1005"/>
+          <w:numId w:val="1010"/>
         </w:numPr>
         <w:pStyle w:val="Compact"/>
       </w:pPr>
@@ -540,7 +1050,7 @@
       <w:pPr>
         <w:numPr>
           <w:ilvl w:val="0"/>
-          <w:numId w:val="1005"/>
+          <w:numId w:val="1010"/>
         </w:numPr>
         <w:pStyle w:val="Compact"/>
       </w:pPr>
@@ -548,8 +1058,20 @@
         <w:t xml:space="preserve">Dead letter queue management with acknowledgment workflow</w:t>
       </w:r>
     </w:p>
-    <w:bookmarkEnd w:id="26"/>
-    <w:bookmarkStart w:id="27" w:name="cli-commands"/>
+    <w:p>
+      <w:pPr>
+        <w:numPr>
+          <w:ilvl w:val="0"/>
+          <w:numId w:val="1010"/>
+        </w:numPr>
+        <w:pStyle w:val="Compact"/>
+      </w:pPr>
+      <w:r>
+        <w:t xml:space="preserve">Navigation to Export, Policies, Holds, Alerts pages</w:t>
+      </w:r>
+    </w:p>
+    <w:bookmarkEnd w:id="31"/>
+    <w:bookmarkStart w:id="32" w:name="cli-commands"/>
     <w:p>
       <w:pPr>
         <w:pStyle w:val="Heading3"/>
@@ -680,14 +1202,43 @@
               <w:jc w:val="left"/>
             </w:pPr>
             <w:r>
-              <w:t xml:space="preserve">Generate reports in text, JSON, or CSV format</w:t>
+              <w:t xml:space="preserve">Generate reports, CSV exports, auditor packs</w:t>
+            </w:r>
+          </w:p>
+        </w:tc>
+      </w:tr>
+      <w:tr>
+        <w:tc>
+          <w:tcPr/>
+          <w:p>
+            <w:pPr>
+              <w:pStyle w:val="Compact"/>
+              <w:jc w:val="left"/>
+            </w:pPr>
+            <w:r>
+              <w:rPr>
+                <w:rStyle w:val="VerbatimChar"/>
+              </w:rPr>
+              <w:t xml:space="preserve">php symfony integrity:retention</w:t>
+            </w:r>
+          </w:p>
+        </w:tc>
+        <w:tc>
+          <w:tcPr/>
+          <w:p>
+            <w:pPr>
+              <w:pStyle w:val="Compact"/>
+              <w:jc w:val="left"/>
+            </w:pPr>
+            <w:r>
+              <w:t xml:space="preserve">Manage retention policies, legal holds, disposition queue</w:t>
             </w:r>
           </w:p>
         </w:tc>
       </w:tr>
     </w:tbl>
-    <w:bookmarkEnd w:id="27"/>
-    <w:bookmarkStart w:id="28" w:name="reporting"/>
+    <w:bookmarkEnd w:id="32"/>
+    <w:bookmarkStart w:id="33" w:name="reporting"/>
     <w:p>
       <w:pPr>
         <w:pStyle w:val="Heading3"/>
@@ -700,7 +1251,7 @@
       <w:pPr>
         <w:numPr>
           <w:ilvl w:val="0"/>
-          <w:numId w:val="1006"/>
+          <w:numId w:val="1011"/>
         </w:numPr>
         <w:pStyle w:val="Compact"/>
       </w:pPr>
@@ -712,7 +1263,7 @@
       <w:pPr>
         <w:numPr>
           <w:ilvl w:val="0"/>
-          <w:numId w:val="1006"/>
+          <w:numId w:val="1011"/>
         </w:numPr>
         <w:pStyle w:val="Compact"/>
       </w:pPr>
@@ -724,7 +1275,7 @@
       <w:pPr>
         <w:numPr>
           <w:ilvl w:val="0"/>
-          <w:numId w:val="1006"/>
+          <w:numId w:val="1011"/>
         </w:numPr>
         <w:pStyle w:val="Compact"/>
       </w:pPr>
@@ -736,7 +1287,7 @@
       <w:pPr>
         <w:numPr>
           <w:ilvl w:val="0"/>
-          <w:numId w:val="1006"/>
+          <w:numId w:val="1011"/>
         </w:numPr>
         <w:pStyle w:val="Compact"/>
       </w:pPr>
@@ -744,9 +1295,33 @@
         <w:t xml:space="preserve">Multi-format output: text (terminal), JSON (integration), CSV (spreadsheets)</w:t>
       </w:r>
     </w:p>
-    <w:bookmarkEnd w:id="28"/>
-    <w:bookmarkEnd w:id="29"/>
-    <w:bookmarkStart w:id="30" w:name="compliance-and-standards"/>
+    <w:p>
+      <w:pPr>
+        <w:numPr>
+          <w:ilvl w:val="0"/>
+          <w:numId w:val="1011"/>
+        </w:numPr>
+        <w:pStyle w:val="Compact"/>
+      </w:pPr>
+      <w:r>
+        <w:t xml:space="preserve">Filtered CSV export with 50,000 row limit</w:t>
+      </w:r>
+    </w:p>
+    <w:p>
+      <w:pPr>
+        <w:numPr>
+          <w:ilvl w:val="0"/>
+          <w:numId w:val="1011"/>
+        </w:numPr>
+        <w:pStyle w:val="Compact"/>
+      </w:pPr>
+      <w:r>
+        <w:t xml:space="preserve">Auditor Pack ZIP for compliance audits</w:t>
+      </w:r>
+    </w:p>
+    <w:bookmarkEnd w:id="33"/>
+    <w:bookmarkEnd w:id="34"/>
+    <w:bookmarkStart w:id="35" w:name="compliance-and-standards"/>
     <w:p>
       <w:pPr>
         <w:pStyle w:val="Heading2"/>
@@ -957,9 +1532,69 @@
           </w:p>
         </w:tc>
       </w:tr>
+      <w:tr>
+        <w:tc>
+          <w:tcPr/>
+          <w:p>
+            <w:pPr>
+              <w:pStyle w:val="Compact"/>
+              <w:jc w:val="left"/>
+            </w:pPr>
+            <w:r>
+              <w:rPr>
+                <w:bCs/>
+                <w:b/>
+              </w:rPr>
+              <w:t xml:space="preserve">Records Retention</w:t>
+            </w:r>
+          </w:p>
+        </w:tc>
+        <w:tc>
+          <w:tcPr/>
+          <w:p>
+            <w:pPr>
+              <w:pStyle w:val="Compact"/>
+              <w:jc w:val="left"/>
+            </w:pPr>
+            <w:r>
+              <w:t xml:space="preserve">Configurable retention policies with disposition review queue</w:t>
+            </w:r>
+          </w:p>
+        </w:tc>
+      </w:tr>
+      <w:tr>
+        <w:tc>
+          <w:tcPr/>
+          <w:p>
+            <w:pPr>
+              <w:pStyle w:val="Compact"/>
+              <w:jc w:val="left"/>
+            </w:pPr>
+            <w:r>
+              <w:rPr>
+                <w:bCs/>
+                <w:b/>
+              </w:rPr>
+              <w:t xml:space="preserve">Legal Hold</w:t>
+            </w:r>
+          </w:p>
+        </w:tc>
+        <w:tc>
+          <w:tcPr/>
+          <w:p>
+            <w:pPr>
+              <w:pStyle w:val="Compact"/>
+              <w:jc w:val="left"/>
+            </w:pPr>
+            <w:r>
+              <w:t xml:space="preserve">Litigation hold capability to prevent disposition of records under review</w:t>
+            </w:r>
+          </w:p>
+        </w:tc>
+      </w:tr>
     </w:tbl>
-    <w:bookmarkEnd w:id="30"/>
-    <w:bookmarkStart w:id="31" w:name="technical-requirements"/>
+    <w:bookmarkEnd w:id="35"/>
+    <w:bookmarkStart w:id="36" w:name="technical-requirements"/>
     <w:p>
       <w:pPr>
         <w:pStyle w:val="Heading2"/>
@@ -1123,7 +1758,7 @@
               <w:jc w:val="left"/>
             </w:pPr>
             <w:r>
-              <w:t xml:space="preserve">MySQL 8.0+ (4 new tables)</w:t>
+              <w:t xml:space="preserve">MySQL 8.0+ (8 tables)</w:t>
             </w:r>
           </w:p>
         </w:tc>
@@ -1189,8 +1824,8 @@
         </w:tc>
       </w:tr>
     </w:tbl>
-    <w:bookmarkEnd w:id="31"/>
-    <w:bookmarkStart w:id="32" w:name="database-tables"/>
+    <w:bookmarkEnd w:id="36"/>
+    <w:bookmarkStart w:id="37" w:name="database-tables"/>
     <w:p>
       <w:pPr>
         <w:pStyle w:val="Heading2"/>
@@ -1321,7 +1956,7 @@
               <w:jc w:val="left"/>
             </w:pPr>
             <w:r>
-              <w:t xml:space="preserve">Append-only verification audit trail</w:t>
+              <w:t xml:space="preserve">Append-only verification audit trail with actor/hostname tracking</w:t>
             </w:r>
           </w:p>
         </w:tc>
@@ -1355,9 +1990,125 @@
           </w:p>
         </w:tc>
       </w:tr>
+      <w:tr>
+        <w:tc>
+          <w:tcPr/>
+          <w:p>
+            <w:pPr>
+              <w:pStyle w:val="Compact"/>
+              <w:jc w:val="left"/>
+            </w:pPr>
+            <w:r>
+              <w:rPr>
+                <w:rStyle w:val="VerbatimChar"/>
+              </w:rPr>
+              <w:t xml:space="preserve">integrity_retention_policy</w:t>
+            </w:r>
+          </w:p>
+        </w:tc>
+        <w:tc>
+          <w:tcPr/>
+          <w:p>
+            <w:pPr>
+              <w:pStyle w:val="Compact"/>
+              <w:jc w:val="left"/>
+            </w:pPr>
+            <w:r>
+              <w:t xml:space="preserve">Retention period definitions and scope rules</w:t>
+            </w:r>
+          </w:p>
+        </w:tc>
+      </w:tr>
+      <w:tr>
+        <w:tc>
+          <w:tcPr/>
+          <w:p>
+            <w:pPr>
+              <w:pStyle w:val="Compact"/>
+              <w:jc w:val="left"/>
+            </w:pPr>
+            <w:r>
+              <w:rPr>
+                <w:rStyle w:val="VerbatimChar"/>
+              </w:rPr>
+              <w:t xml:space="preserve">integrity_legal_hold</w:t>
+            </w:r>
+          </w:p>
+        </w:tc>
+        <w:tc>
+          <w:tcPr/>
+          <w:p>
+            <w:pPr>
+              <w:pStyle w:val="Compact"/>
+              <w:jc w:val="left"/>
+            </w:pPr>
+            <w:r>
+              <w:t xml:space="preserve">Legal holds blocking disposition</w:t>
+            </w:r>
+          </w:p>
+        </w:tc>
+      </w:tr>
+      <w:tr>
+        <w:tc>
+          <w:tcPr/>
+          <w:p>
+            <w:pPr>
+              <w:pStyle w:val="Compact"/>
+              <w:jc w:val="left"/>
+            </w:pPr>
+            <w:r>
+              <w:rPr>
+                <w:rStyle w:val="VerbatimChar"/>
+              </w:rPr>
+              <w:t xml:space="preserve">integrity_disposition_queue</w:t>
+            </w:r>
+          </w:p>
+        </w:tc>
+        <w:tc>
+          <w:tcPr/>
+          <w:p>
+            <w:pPr>
+              <w:pStyle w:val="Compact"/>
+              <w:jc w:val="left"/>
+            </w:pPr>
+            <w:r>
+              <w:t xml:space="preserve">Disposition review queue</w:t>
+            </w:r>
+          </w:p>
+        </w:tc>
+      </w:tr>
+      <w:tr>
+        <w:tc>
+          <w:tcPr/>
+          <w:p>
+            <w:pPr>
+              <w:pStyle w:val="Compact"/>
+              <w:jc w:val="left"/>
+            </w:pPr>
+            <w:r>
+              <w:rPr>
+                <w:rStyle w:val="VerbatimChar"/>
+              </w:rPr>
+              <w:t xml:space="preserve">integrity_alert_config</w:t>
+            </w:r>
+          </w:p>
+        </w:tc>
+        <w:tc>
+          <w:tcPr/>
+          <w:p>
+            <w:pPr>
+              <w:pStyle w:val="Compact"/>
+              <w:jc w:val="left"/>
+            </w:pPr>
+            <w:r>
+              <w:t xml:space="preserve">Threshold-based alert configuration</w:t>
+            </w:r>
+          </w:p>
+        </w:tc>
+      </w:tr>
     </w:tbl>
-    <w:bookmarkEnd w:id="32"/>
-    <w:bookmarkStart w:id="33" w:name="recommended-cron-configuration"/>
+    <w:bookmarkEnd w:id="37"/>
+    <w:bookmarkStart w:id="38" w:name="recommended-cron-configuration"/>
     <w:p>
       <w:pPr>
         <w:pStyle w:val="Heading2"/>
@@ -1395,6 +2146,27 @@
         <w:rPr>
           <w:rStyle w:val="VerbatimChar"/>
         </w:rPr>
+        <w:t xml:space="preserve"># Scan for retention-eligible objects daily at 1am</w:t>
+      </w:r>
+      <w:r>
+        <w:br/>
+      </w:r>
+      <w:r>
+        <w:rPr>
+          <w:rStyle w:val="VerbatimChar"/>
+        </w:rPr>
+        <w:t xml:space="preserve">0 1 * * * cd /usr/share/nginx/archive &amp;&amp; php symfony integrity:retention --scan-eligible &gt;&gt; /var/log/atom/integrity-retention.log 2&gt;&amp;1</w:t>
+      </w:r>
+      <w:r>
+        <w:br/>
+      </w:r>
+      <w:r>
+        <w:br/>
+      </w:r>
+      <w:r>
+        <w:rPr>
+          <w:rStyle w:val="VerbatimChar"/>
+        </w:rPr>
         <w:t xml:space="preserve"># Weekly integrity summary report (Monday 8am)</w:t>
       </w:r>
       <w:r>
@@ -1407,8 +2179,8 @@
         <w:t xml:space="preserve">0 8 * * 1 cd /usr/share/nginx/archive &amp;&amp; php symfony integrity:report --summary &gt;&gt; /var/log/atom/integrity-report.log 2&gt;&amp;1</w:t>
       </w:r>
     </w:p>
-    <w:bookmarkEnd w:id="33"/>
-    <w:bookmarkStart w:id="34" w:name="web-interface"/>
+    <w:bookmarkEnd w:id="38"/>
+    <w:bookmarkStart w:id="39" w:name="web-interface"/>
     <w:p>
       <w:pPr>
         <w:pStyle w:val="Heading2"/>
@@ -1530,7 +2302,7 @@
               <w:jc w:val="left"/>
             </w:pPr>
             <w:r>
-              <w:t xml:space="preserve">Statistics, health overview, recent activity</w:t>
+              <w:t xml:space="preserve">Statistics, health overview, trend chart, breakdowns</w:t>
             </w:r>
           </w:p>
         </w:tc>
@@ -1740,9 +2512,214 @@
           </w:p>
         </w:tc>
       </w:tr>
+      <w:tr>
+        <w:tc>
+          <w:tcPr/>
+          <w:p>
+            <w:pPr>
+              <w:pStyle w:val="Compact"/>
+              <w:jc w:val="left"/>
+            </w:pPr>
+            <w:r>
+              <w:t xml:space="preserve">Export</w:t>
+            </w:r>
+          </w:p>
+        </w:tc>
+        <w:tc>
+          <w:tcPr/>
+          <w:p>
+            <w:pPr>
+              <w:pStyle w:val="Compact"/>
+              <w:jc w:val="left"/>
+            </w:pPr>
+            <w:r>
+              <w:rPr>
+                <w:rStyle w:val="VerbatimChar"/>
+              </w:rPr>
+              <w:t xml:space="preserve">/admin/integrity/export</w:t>
+            </w:r>
+          </w:p>
+        </w:tc>
+        <w:tc>
+          <w:tcPr/>
+          <w:p>
+            <w:pPr>
+              <w:pStyle w:val="Compact"/>
+              <w:jc w:val="left"/>
+            </w:pPr>
+            <w:r>
+              <w:t xml:space="preserve">CSV export and Auditor Pack download</w:t>
+            </w:r>
+          </w:p>
+        </w:tc>
+      </w:tr>
+      <w:tr>
+        <w:tc>
+          <w:tcPr/>
+          <w:p>
+            <w:pPr>
+              <w:pStyle w:val="Compact"/>
+              <w:jc w:val="left"/>
+            </w:pPr>
+            <w:r>
+              <w:t xml:space="preserve">Policies</w:t>
+            </w:r>
+          </w:p>
+        </w:tc>
+        <w:tc>
+          <w:tcPr/>
+          <w:p>
+            <w:pPr>
+              <w:pStyle w:val="Compact"/>
+              <w:jc w:val="left"/>
+            </w:pPr>
+            <w:r>
+              <w:rPr>
+                <w:rStyle w:val="VerbatimChar"/>
+              </w:rPr>
+              <w:t xml:space="preserve">/admin/integrity/policies</w:t>
+            </w:r>
+          </w:p>
+        </w:tc>
+        <w:tc>
+          <w:tcPr/>
+          <w:p>
+            <w:pPr>
+              <w:pStyle w:val="Compact"/>
+              <w:jc w:val="left"/>
+            </w:pPr>
+            <w:r>
+              <w:t xml:space="preserve">Retention policy management</w:t>
+            </w:r>
+          </w:p>
+        </w:tc>
+      </w:tr>
+      <w:tr>
+        <w:tc>
+          <w:tcPr/>
+          <w:p>
+            <w:pPr>
+              <w:pStyle w:val="Compact"/>
+              <w:jc w:val="left"/>
+            </w:pPr>
+            <w:r>
+              <w:t xml:space="preserve">Holds</w:t>
+            </w:r>
+          </w:p>
+        </w:tc>
+        <w:tc>
+          <w:tcPr/>
+          <w:p>
+            <w:pPr>
+              <w:pStyle w:val="Compact"/>
+              <w:jc w:val="left"/>
+            </w:pPr>
+            <w:r>
+              <w:rPr>
+                <w:rStyle w:val="VerbatimChar"/>
+              </w:rPr>
+              <w:t xml:space="preserve">/admin/integrity/holds</w:t>
+            </w:r>
+          </w:p>
+        </w:tc>
+        <w:tc>
+          <w:tcPr/>
+          <w:p>
+            <w:pPr>
+              <w:pStyle w:val="Compact"/>
+              <w:jc w:val="left"/>
+            </w:pPr>
+            <w:r>
+              <w:t xml:space="preserve">Legal hold management</w:t>
+            </w:r>
+          </w:p>
+        </w:tc>
+      </w:tr>
+      <w:tr>
+        <w:tc>
+          <w:tcPr/>
+          <w:p>
+            <w:pPr>
+              <w:pStyle w:val="Compact"/>
+              <w:jc w:val="left"/>
+            </w:pPr>
+            <w:r>
+              <w:t xml:space="preserve">Disposition</w:t>
+            </w:r>
+          </w:p>
+        </w:tc>
+        <w:tc>
+          <w:tcPr/>
+          <w:p>
+            <w:pPr>
+              <w:pStyle w:val="Compact"/>
+              <w:jc w:val="left"/>
+            </w:pPr>
+            <w:r>
+              <w:rPr>
+                <w:rStyle w:val="VerbatimChar"/>
+              </w:rPr>
+              <w:t xml:space="preserve">/admin/integrity/disposition</w:t>
+            </w:r>
+          </w:p>
+        </w:tc>
+        <w:tc>
+          <w:tcPr/>
+          <w:p>
+            <w:pPr>
+              <w:pStyle w:val="Compact"/>
+              <w:jc w:val="left"/>
+            </w:pPr>
+            <w:r>
+              <w:t xml:space="preserve">Disposition review queue</w:t>
+            </w:r>
+          </w:p>
+        </w:tc>
+      </w:tr>
+      <w:tr>
+        <w:tc>
+          <w:tcPr/>
+          <w:p>
+            <w:pPr>
+              <w:pStyle w:val="Compact"/>
+              <w:jc w:val="left"/>
+            </w:pPr>
+            <w:r>
+              <w:t xml:space="preserve">Alerts</w:t>
+            </w:r>
+          </w:p>
+        </w:tc>
+        <w:tc>
+          <w:tcPr/>
+          <w:p>
+            <w:pPr>
+              <w:pStyle w:val="Compact"/>
+              <w:jc w:val="left"/>
+            </w:pPr>
+            <w:r>
+              <w:rPr>
+                <w:rStyle w:val="VerbatimChar"/>
+              </w:rPr>
+              <w:t xml:space="preserve">/admin/integrity/alerts</w:t>
+            </w:r>
+          </w:p>
+        </w:tc>
+        <w:tc>
+          <w:tcPr/>
+          <w:p>
+            <w:pPr>
+              <w:pStyle w:val="Compact"/>
+              <w:jc w:val="left"/>
+            </w:pPr>
+            <w:r>
+              <w:t xml:space="preserve">Threshold-based alert configuration</w:t>
+            </w:r>
+          </w:p>
+        </w:tc>
+      </w:tr>
     </w:tbl>
-    <w:bookmarkEnd w:id="34"/>
-    <w:bookmarkStart w:id="35" w:name="installation"/>
+    <w:bookmarkEnd w:id="39"/>
+    <w:bookmarkStart w:id="40" w:name="installation"/>
     <w:p>
       <w:pPr>
         <w:pStyle w:val="Heading2"/>
@@ -1864,7 +2841,7 @@
         <w:rPr>
           <w:rStyle w:val="CommentTok"/>
         </w:rPr>
-        <w:t xml:space="preserve"># 4. Verify installation</w:t>
+        <w:t xml:space="preserve"># 4. Run schema migration (adds actor/hostname columns if upgrading from v1.0.0)</w:t>
       </w:r>
       <w:r>
         <w:br/>
@@ -1880,6 +2857,39 @@
           <w:rStyle w:val="NormalTok"/>
         </w:rPr>
         <w:t xml:space="preserve"> symfony integrity:verify </w:t>
+      </w:r>
+      <w:r>
+        <w:rPr>
+          <w:rStyle w:val="AttributeTok"/>
+        </w:rPr>
+        <w:t xml:space="preserve">--status</w:t>
+      </w:r>
+      <w:r>
+        <w:br/>
+      </w:r>
+      <w:r>
+        <w:br/>
+      </w:r>
+      <w:r>
+        <w:rPr>
+          <w:rStyle w:val="CommentTok"/>
+        </w:rPr>
+        <w:t xml:space="preserve"># 5. Verify installation</w:t>
+      </w:r>
+      <w:r>
+        <w:br/>
+      </w:r>
+      <w:r>
+        <w:rPr>
+          <w:rStyle w:val="ExtensionTok"/>
+        </w:rPr>
+        <w:t xml:space="preserve">php</w:t>
+      </w:r>
+      <w:r>
+        <w:rPr>
+          <w:rStyle w:val="NormalTok"/>
+        </w:rPr>
+        <w:t xml:space="preserve"> symfony integrity:retention </w:t>
       </w:r>
       <w:r>
         <w:rPr>
@@ -1907,8 +2917,8 @@
         <w:t xml:space="preserve">AtoM Heratio is developed by The Archive and Heritage Group (Pty) Ltd for the international GLAM and DAM community.</w:t>
       </w:r>
     </w:p>
-    <w:bookmarkEnd w:id="35"/>
-    <w:bookmarkEnd w:id="36"/>
+    <w:bookmarkEnd w:id="40"/>
+    <w:bookmarkEnd w:id="41"/>
     <w:sectPr/>
   </w:body>
 </w:document>
@@ -2110,6 +3120,21 @@
     <w:abstractNumId w:val="991"/>
   </w:num>
   <w:num w:numId="1006">
+    <w:abstractNumId w:val="991"/>
+  </w:num>
+  <w:num w:numId="1007">
+    <w:abstractNumId w:val="991"/>
+  </w:num>
+  <w:num w:numId="1008">
+    <w:abstractNumId w:val="991"/>
+  </w:num>
+  <w:num w:numId="1009">
+    <w:abstractNumId w:val="991"/>
+  </w:num>
+  <w:num w:numId="1010">
+    <w:abstractNumId w:val="991"/>
+  </w:num>
+  <w:num w:numId="1011">
     <w:abstractNumId w:val="991"/>
   </w:num>
 </w:numbering>

</xml_diff>

<commit_message>
ahgIntegrityPlugin v1.2.0: previous_hash chain, object_format filter, Chart.js dashboard, 9 API endpoints, security DevOps, full documentation suite
</commit_message>
<xml_diff>
--- a/ahgIntegrityPlugin/docs/AtoM_Heratio_IntegrityAssurance_Feature_Overview.docx
+++ b/ahgIntegrityPlugin/docs/AtoM_Heratio_IntegrityAssurance_Feature_Overview.docx
@@ -18,7 +18,7 @@
         <w:t xml:space="preserve">The Archive and Heritage Group (Pty) Ltd</w:t>
       </w:r>
     </w:p>
-    <w:bookmarkStart w:id="41" w:name="atom-heratio-integrity-assurance-plugin"/>
+    <w:bookmarkStart w:id="42" w:name="atom-heratio-integrity-assurance-plugin"/>
     <w:p>
       <w:pPr>
         <w:pStyle w:val="Heading1"/>
@@ -51,7 +51,7 @@
         <w:t xml:space="preserve"> </w:t>
       </w:r>
       <w:r>
-        <w:t xml:space="preserve">ahgIntegrityPlugin v1.1.0</w:t>
+        <w:t xml:space="preserve">ahgIntegrityPlugin v1.2.0</w:t>
       </w:r>
       <w:r>
         <w:t xml:space="preserve"> </w:t>
@@ -136,7 +136,7 @@
       </w:r>
     </w:p>
     <w:bookmarkEnd w:id="21"/>
-    <w:bookmarkStart w:id="34" w:name="key-features"/>
+    <w:bookmarkStart w:id="35" w:name="key-features"/>
     <w:p>
       <w:pPr>
         <w:pStyle w:val="Heading2"/>
@@ -439,6 +439,28 @@
         <w:pStyle w:val="Compact"/>
       </w:pPr>
       <w:r>
+        <w:rPr>
+          <w:bCs/>
+          <w:b/>
+        </w:rPr>
+        <w:t xml:space="preserve">Previous hash chain</w:t>
+      </w:r>
+      <w:r>
+        <w:t xml:space="preserve"> </w:t>
+      </w:r>
+      <w:r>
+        <w:t xml:space="preserve">(v1.2.0): Each ledger entry records the computed hash of the prior successful verification, enabling tamper detection and chain-of-custody verification</w:t>
+      </w:r>
+    </w:p>
+    <w:p>
+      <w:pPr>
+        <w:numPr>
+          <w:ilvl w:val="0"/>
+          <w:numId w:val="1003"/>
+        </w:numPr>
+        <w:pStyle w:val="Compact"/>
+      </w:pPr>
+      <w:r>
         <w:t xml:space="preserve">Denormalized repository and information object IDs for efficient scoped queries</w:t>
       </w:r>
     </w:p>
@@ -610,13 +632,13 @@
       </w:r>
     </w:p>
     <w:bookmarkEnd w:id="26"/>
-    <w:bookmarkStart w:id="27" w:name="retention-policy-engine-v1.1.0"/>
+    <w:bookmarkStart w:id="27" w:name="Xc4b541611073aeb4eeea3280a0b3896b587a223"/>
     <w:p>
       <w:pPr>
         <w:pStyle w:val="Heading3"/>
       </w:pPr>
       <w:r>
-        <w:t xml:space="preserve">Retention Policy Engine (v1.1.0)</w:t>
+        <w:t xml:space="preserve">Retention Policy Engine (v1.1.0, enhanced v1.2.0)</w:t>
       </w:r>
     </w:p>
     <w:p>
@@ -689,10 +711,37 @@
           <w:bCs/>
           <w:b/>
         </w:rPr>
-        <w:t xml:space="preserve">Disposition review queue</w:t>
-      </w:r>
-      <w:r>
-        <w:t xml:space="preserve">: Eligible, Pending Review, Approved, Rejected, Held, Disposed</w:t>
+        <w:t xml:space="preserve">Object format filter</w:t>
+      </w:r>
+      <w:r>
+        <w:t xml:space="preserve"> </w:t>
+      </w:r>
+      <w:r>
+        <w:t xml:space="preserve">(v1.2.0): Restrict policies to specific MIME types (e.g.,</w:t>
+      </w:r>
+      <w:r>
+        <w:t xml:space="preserve"> </w:t>
+      </w:r>
+      <w:r>
+        <w:rPr>
+          <w:rStyle w:val="VerbatimChar"/>
+        </w:rPr>
+        <w:t xml:space="preserve">image/tiff</w:t>
+      </w:r>
+      <w:r>
+        <w:t xml:space="preserve">,</w:t>
+      </w:r>
+      <w:r>
+        <w:t xml:space="preserve"> </w:t>
+      </w:r>
+      <w:r>
+        <w:rPr>
+          <w:rStyle w:val="VerbatimChar"/>
+        </w:rPr>
+        <w:t xml:space="preserve">application/pdf</w:t>
+      </w:r>
+      <w:r>
+        <w:t xml:space="preserve">) using prefix matching</w:t>
       </w:r>
     </w:p>
     <w:p>
@@ -708,6 +757,25 @@
           <w:bCs/>
           <w:b/>
         </w:rPr>
+        <w:t xml:space="preserve">Disposition review queue</w:t>
+      </w:r>
+      <w:r>
+        <w:t xml:space="preserve">: Eligible, Pending Review, Approved, Rejected, Held, Disposed</w:t>
+      </w:r>
+    </w:p>
+    <w:p>
+      <w:pPr>
+        <w:numPr>
+          <w:ilvl w:val="0"/>
+          <w:numId w:val="1006"/>
+        </w:numPr>
+        <w:pStyle w:val="Compact"/>
+      </w:pPr>
+      <w:r>
+        <w:rPr>
+          <w:bCs/>
+          <w:b/>
+        </w:rPr>
         <w:t xml:space="preserve">Safe disposition</w:t>
       </w:r>
       <w:r>
@@ -896,13 +964,13 @@
       </w:r>
     </w:p>
     <w:bookmarkEnd w:id="29"/>
-    <w:bookmarkStart w:id="30" w:name="enhanced-dashboard-v1.1.0"/>
+    <w:bookmarkStart w:id="30" w:name="X27d26c779a3cb5a5f64723e5bc6fc4519ecdaaf"/>
     <w:p>
       <w:pPr>
         <w:pStyle w:val="Heading3"/>
       </w:pPr>
       <w:r>
-        <w:t xml:space="preserve">Enhanced Dashboard (v1.1.0)</w:t>
+        <w:t xml:space="preserve">Enhanced Dashboard (v1.1.0, enhanced v1.2.0)</w:t>
       </w:r>
     </w:p>
     <w:p>
@@ -956,10 +1024,13 @@
           <w:bCs/>
           <w:b/>
         </w:rPr>
-        <w:t xml:space="preserve">Daily Trend chart</w:t>
-      </w:r>
-      <w:r>
-        <w:t xml:space="preserve">: CSS-only horizontal bar chart (30 days), green=pass, red=fail</w:t>
+        <w:t xml:space="preserve">Storage growth KPI</w:t>
+      </w:r>
+      <w:r>
+        <w:t xml:space="preserve"> </w:t>
+      </w:r>
+      <w:r>
+        <w:t xml:space="preserve">(v1.2.0): Total storage scanned and average GB/day over 30 days</w:t>
       </w:r>
     </w:p>
     <w:p>
@@ -975,10 +1046,10 @@
           <w:bCs/>
           <w:b/>
         </w:rPr>
-        <w:t xml:space="preserve">Repository Breakdown table</w:t>
-      </w:r>
-      <w:r>
-        <w:t xml:space="preserve">: Per-repository totals, pass/fail counts, pass rate</w:t>
+        <w:t xml:space="preserve">Daily Trend chart</w:t>
+      </w:r>
+      <w:r>
+        <w:t xml:space="preserve">: Interactive Chart.js stacked bar chart (v1.2.0, upgraded from CSS bars), green=pass, red=fail</w:t>
       </w:r>
     </w:p>
     <w:p>
@@ -994,10 +1065,73 @@
           <w:bCs/>
           <w:b/>
         </w:rPr>
+        <w:t xml:space="preserve">Repository Breakdown table</w:t>
+      </w:r>
+      <w:r>
+        <w:t xml:space="preserve">: Per-repository totals, pass/fail counts, pass rate — clickable for drill-down filtering (v1.2.0)</w:t>
+      </w:r>
+    </w:p>
+    <w:p>
+      <w:pPr>
+        <w:numPr>
+          <w:ilvl w:val="0"/>
+          <w:numId w:val="1009"/>
+        </w:numPr>
+        <w:pStyle w:val="Compact"/>
+      </w:pPr>
+      <w:r>
+        <w:rPr>
+          <w:bCs/>
+          <w:b/>
+        </w:rPr>
         <w:t xml:space="preserve">Failure Type Breakdown table</w:t>
       </w:r>
       <w:r>
         <w:t xml:space="preserve">: Outcome distribution with percentages</w:t>
+      </w:r>
+    </w:p>
+    <w:p>
+      <w:pPr>
+        <w:numPr>
+          <w:ilvl w:val="0"/>
+          <w:numId w:val="1009"/>
+        </w:numPr>
+        <w:pStyle w:val="Compact"/>
+      </w:pPr>
+      <w:r>
+        <w:rPr>
+          <w:bCs/>
+          <w:b/>
+        </w:rPr>
+        <w:t xml:space="preserve">Format Breakdown table</w:t>
+      </w:r>
+      <w:r>
+        <w:t xml:space="preserve"> </w:t>
+      </w:r>
+      <w:r>
+        <w:t xml:space="preserve">(v1.2.0): Verification results by file format (PRONOM)</w:t>
+      </w:r>
+    </w:p>
+    <w:p>
+      <w:pPr>
+        <w:numPr>
+          <w:ilvl w:val="0"/>
+          <w:numId w:val="1009"/>
+        </w:numPr>
+        <w:pStyle w:val="Compact"/>
+      </w:pPr>
+      <w:r>
+        <w:rPr>
+          <w:bCs/>
+          <w:b/>
+        </w:rPr>
+        <w:t xml:space="preserve">Repository filter</w:t>
+      </w:r>
+      <w:r>
+        <w:t xml:space="preserve"> </w:t>
+      </w:r>
+      <w:r>
+        <w:t xml:space="preserve">(v1.2.0): Dropdown filter to scope all dashboard statistics to a specific repository</w:t>
       </w:r>
     </w:p>
     <w:bookmarkEnd w:id="30"/>
@@ -1238,12 +1372,184 @@
       </w:tr>
     </w:tbl>
     <w:bookmarkEnd w:id="32"/>
-    <w:bookmarkStart w:id="33" w:name="reporting"/>
+    <w:bookmarkStart w:id="33" w:name="rest-api-v1.2.0"/>
     <w:p>
       <w:pPr>
         <w:pStyle w:val="Heading3"/>
       </w:pPr>
       <w:r>
+        <w:t xml:space="preserve">REST API (v1.2.0)</w:t>
+      </w:r>
+    </w:p>
+    <w:p>
+      <w:pPr>
+        <w:numPr>
+          <w:ilvl w:val="0"/>
+          <w:numId w:val="1011"/>
+        </w:numPr>
+        <w:pStyle w:val="Compact"/>
+      </w:pPr>
+      <w:r>
+        <w:rPr>
+          <w:bCs/>
+          <w:b/>
+        </w:rPr>
+        <w:t xml:space="preserve">25+ JSON API endpoints</w:t>
+      </w:r>
+      <w:r>
+        <w:t xml:space="preserve"> </w:t>
+      </w:r>
+      <w:r>
+        <w:t xml:space="preserve">for integration with external monitoring and automation systems</w:t>
+      </w:r>
+    </w:p>
+    <w:p>
+      <w:pPr>
+        <w:numPr>
+          <w:ilvl w:val="0"/>
+          <w:numId w:val="1011"/>
+        </w:numPr>
+        <w:pStyle w:val="Compact"/>
+      </w:pPr>
+      <w:r>
+        <w:rPr>
+          <w:bCs/>
+          <w:b/>
+        </w:rPr>
+        <w:t xml:space="preserve">Paginated list endpoints</w:t>
+      </w:r>
+      <w:r>
+        <w:t xml:space="preserve">: Ledger, runs, holds, policies with configurable</w:t>
+      </w:r>
+      <w:r>
+        <w:t xml:space="preserve"> </w:t>
+      </w:r>
+      <w:r>
+        <w:rPr>
+          <w:rStyle w:val="VerbatimChar"/>
+        </w:rPr>
+        <w:t xml:space="preserve">limit</w:t>
+      </w:r>
+      <w:r>
+        <w:t xml:space="preserve"> </w:t>
+      </w:r>
+      <w:r>
+        <w:t xml:space="preserve">and</w:t>
+      </w:r>
+      <w:r>
+        <w:t xml:space="preserve"> </w:t>
+      </w:r>
+      <w:r>
+        <w:rPr>
+          <w:rStyle w:val="VerbatimChar"/>
+        </w:rPr>
+        <w:t xml:space="preserve">skip</w:t>
+      </w:r>
+      <w:r>
+        <w:t xml:space="preserve"> </w:t>
+      </w:r>
+      <w:r>
+        <w:t xml:space="preserve">parameters</w:t>
+      </w:r>
+    </w:p>
+    <w:p>
+      <w:pPr>
+        <w:numPr>
+          <w:ilvl w:val="0"/>
+          <w:numId w:val="1011"/>
+        </w:numPr>
+        <w:pStyle w:val="Compact"/>
+      </w:pPr>
+      <w:r>
+        <w:rPr>
+          <w:bCs/>
+          <w:b/>
+        </w:rPr>
+        <w:t xml:space="preserve">Analytics endpoints</w:t>
+      </w:r>
+      <w:r>
+        <w:t xml:space="preserve">: Daily trend, repository breakdown, format breakdown, throughput, storage growth</w:t>
+      </w:r>
+    </w:p>
+    <w:p>
+      <w:pPr>
+        <w:numPr>
+          <w:ilvl w:val="0"/>
+          <w:numId w:val="1011"/>
+        </w:numPr>
+        <w:pStyle w:val="Compact"/>
+      </w:pPr>
+      <w:r>
+        <w:rPr>
+          <w:bCs/>
+          <w:b/>
+        </w:rPr>
+        <w:t xml:space="preserve">Action endpoints</w:t>
+      </w:r>
+      <w:r>
+        <w:t xml:space="preserve">: Verify objects, manage schedules, retention policies, legal holds, alerts</w:t>
+      </w:r>
+    </w:p>
+    <w:p>
+      <w:pPr>
+        <w:numPr>
+          <w:ilvl w:val="0"/>
+          <w:numId w:val="1011"/>
+        </w:numPr>
+        <w:pStyle w:val="Compact"/>
+      </w:pPr>
+      <w:r>
+        <w:rPr>
+          <w:bCs/>
+          <w:b/>
+        </w:rPr>
+        <w:t xml:space="preserve">OpenAPI specification</w:t>
+      </w:r>
+      <w:r>
+        <w:t xml:space="preserve">: Full OpenAPI 3.0.3 documentation included (see</w:t>
+      </w:r>
+      <w:r>
+        <w:t xml:space="preserve"> </w:t>
+      </w:r>
+      <w:r>
+        <w:rPr>
+          <w:rStyle w:val="VerbatimChar"/>
+        </w:rPr>
+        <w:t xml:space="preserve">docs/openapi.yaml</w:t>
+      </w:r>
+      <w:r>
+        <w:t xml:space="preserve">)</w:t>
+      </w:r>
+    </w:p>
+    <w:p>
+      <w:pPr>
+        <w:numPr>
+          <w:ilvl w:val="0"/>
+          <w:numId w:val="1011"/>
+        </w:numPr>
+        <w:pStyle w:val="Compact"/>
+      </w:pPr>
+      <w:r>
+        <w:rPr>
+          <w:bCs/>
+          <w:b/>
+        </w:rPr>
+        <w:t xml:space="preserve">Admin authentication required</w:t>
+      </w:r>
+      <w:r>
+        <w:t xml:space="preserve"> </w:t>
+      </w:r>
+      <w:r>
+        <w:t xml:space="preserve">on all endpoints</w:t>
+      </w:r>
+    </w:p>
+    <w:bookmarkEnd w:id="33"/>
+    <w:bookmarkStart w:id="34" w:name="reporting"/>
+    <w:p>
+      <w:pPr>
+        <w:pStyle w:val="Heading3"/>
+      </w:pPr>
+      <w:r>
         <w:t xml:space="preserve">Reporting</w:t>
       </w:r>
     </w:p>
@@ -1251,7 +1557,7 @@
       <w:pPr>
         <w:numPr>
           <w:ilvl w:val="0"/>
-          <w:numId w:val="1011"/>
+          <w:numId w:val="1012"/>
         </w:numPr>
         <w:pStyle w:val="Compact"/>
       </w:pPr>
@@ -1263,7 +1569,7 @@
       <w:pPr>
         <w:numPr>
           <w:ilvl w:val="0"/>
-          <w:numId w:val="1011"/>
+          <w:numId w:val="1012"/>
         </w:numPr>
         <w:pStyle w:val="Compact"/>
       </w:pPr>
@@ -1275,7 +1581,7 @@
       <w:pPr>
         <w:numPr>
           <w:ilvl w:val="0"/>
-          <w:numId w:val="1011"/>
+          <w:numId w:val="1012"/>
         </w:numPr>
         <w:pStyle w:val="Compact"/>
       </w:pPr>
@@ -1287,7 +1593,7 @@
       <w:pPr>
         <w:numPr>
           <w:ilvl w:val="0"/>
-          <w:numId w:val="1011"/>
+          <w:numId w:val="1012"/>
         </w:numPr>
         <w:pStyle w:val="Compact"/>
       </w:pPr>
@@ -1299,7 +1605,7 @@
       <w:pPr>
         <w:numPr>
           <w:ilvl w:val="0"/>
-          <w:numId w:val="1011"/>
+          <w:numId w:val="1012"/>
         </w:numPr>
         <w:pStyle w:val="Compact"/>
       </w:pPr>
@@ -1311,7 +1617,7 @@
       <w:pPr>
         <w:numPr>
           <w:ilvl w:val="0"/>
-          <w:numId w:val="1011"/>
+          <w:numId w:val="1012"/>
         </w:numPr>
         <w:pStyle w:val="Compact"/>
       </w:pPr>
@@ -1319,9 +1625,9 @@
         <w:t xml:space="preserve">Auditor Pack ZIP for compliance audits</w:t>
       </w:r>
     </w:p>
-    <w:bookmarkEnd w:id="33"/>
     <w:bookmarkEnd w:id="34"/>
-    <w:bookmarkStart w:id="35" w:name="compliance-and-standards"/>
+    <w:bookmarkEnd w:id="35"/>
+    <w:bookmarkStart w:id="36" w:name="compliance-and-standards"/>
     <w:p>
       <w:pPr>
         <w:pStyle w:val="Heading2"/>
@@ -1545,6 +1851,42 @@
                 <w:bCs/>
                 <w:b/>
               </w:rPr>
+              <w:t xml:space="preserve">ISO 15489</w:t>
+            </w:r>
+            <w:r>
+              <w:t xml:space="preserve"> </w:t>
+            </w:r>
+            <w:r>
+              <w:t xml:space="preserve">(Records Management)</w:t>
+            </w:r>
+          </w:p>
+        </w:tc>
+        <w:tc>
+          <w:tcPr/>
+          <w:p>
+            <w:pPr>
+              <w:pStyle w:val="Compact"/>
+              <w:jc w:val="left"/>
+            </w:pPr>
+            <w:r>
+              <w:t xml:space="preserve">Supports authenticity, reliability, integrity, and usability requirements</w:t>
+            </w:r>
+          </w:p>
+        </w:tc>
+      </w:tr>
+      <w:tr>
+        <w:tc>
+          <w:tcPr/>
+          <w:p>
+            <w:pPr>
+              <w:pStyle w:val="Compact"/>
+              <w:jc w:val="left"/>
+            </w:pPr>
+            <w:r>
+              <w:rPr>
+                <w:bCs/>
+                <w:b/>
+              </w:rPr>
               <w:t xml:space="preserve">Records Retention</w:t>
             </w:r>
           </w:p>
@@ -1593,8 +1935,8 @@
         </w:tc>
       </w:tr>
     </w:tbl>
-    <w:bookmarkEnd w:id="35"/>
-    <w:bookmarkStart w:id="36" w:name="technical-requirements"/>
+    <w:bookmarkEnd w:id="36"/>
+    <w:bookmarkStart w:id="37" w:name="technical-requirements"/>
     <w:p>
       <w:pPr>
         <w:pStyle w:val="Heading2"/>
@@ -1824,8 +2166,8 @@
         </w:tc>
       </w:tr>
     </w:tbl>
-    <w:bookmarkEnd w:id="36"/>
-    <w:bookmarkStart w:id="37" w:name="database-tables"/>
+    <w:bookmarkEnd w:id="37"/>
+    <w:bookmarkStart w:id="38" w:name="database-tables"/>
     <w:p>
       <w:pPr>
         <w:pStyle w:val="Heading2"/>
@@ -2107,8 +2449,8 @@
         </w:tc>
       </w:tr>
     </w:tbl>
-    <w:bookmarkEnd w:id="37"/>
-    <w:bookmarkStart w:id="38" w:name="recommended-cron-configuration"/>
+    <w:bookmarkEnd w:id="38"/>
+    <w:bookmarkStart w:id="39" w:name="recommended-cron-configuration"/>
     <w:p>
       <w:pPr>
         <w:pStyle w:val="Heading2"/>
@@ -2179,8 +2521,8 @@
         <w:t xml:space="preserve">0 8 * * 1 cd /usr/share/nginx/archive &amp;&amp; php symfony integrity:report --summary &gt;&gt; /var/log/atom/integrity-report.log 2&gt;&amp;1</w:t>
       </w:r>
     </w:p>
-    <w:bookmarkEnd w:id="38"/>
-    <w:bookmarkStart w:id="39" w:name="web-interface"/>
+    <w:bookmarkEnd w:id="39"/>
+    <w:bookmarkStart w:id="40" w:name="web-interface"/>
     <w:p>
       <w:pPr>
         <w:pStyle w:val="Heading2"/>
@@ -2718,8 +3060,8 @@
         </w:tc>
       </w:tr>
     </w:tbl>
-    <w:bookmarkEnd w:id="39"/>
-    <w:bookmarkStart w:id="40" w:name="installation"/>
+    <w:bookmarkEnd w:id="40"/>
+    <w:bookmarkStart w:id="41" w:name="installation"/>
     <w:p>
       <w:pPr>
         <w:pStyle w:val="Heading2"/>
@@ -2917,8 +3259,8 @@
         <w:t xml:space="preserve">AtoM Heratio is developed by The Archive and Heritage Group (Pty) Ltd for the international GLAM and DAM community.</w:t>
       </w:r>
     </w:p>
-    <w:bookmarkEnd w:id="40"/>
     <w:bookmarkEnd w:id="41"/>
+    <w:bookmarkEnd w:id="42"/>
     <w:sectPr/>
   </w:body>
 </w:document>
@@ -3135,6 +3477,9 @@
     <w:abstractNumId w:val="991"/>
   </w:num>
   <w:num w:numId="1011">
+    <w:abstractNumId w:val="991"/>
+  </w:num>
+  <w:num w:numId="1012">
     <w:abstractNumId w:val="991"/>
   </w:num>
 </w:numbering>

</xml_diff>